<commit_message>
Pictures in Manual and Quick Starrt Guide adapted to newest AWATAR version
</commit_message>
<xml_diff>
--- a/quickstart/AWATAR_QuickStartGuide.docx
+++ b/quickstart/AWATAR_QuickStartGuide.docx
@@ -250,14 +250,11 @@
     </w:p>
     <w:p>
       <w:r>
-        <w:rPr>
-          <w:noProof/>
-        </w:rPr>
         <w:drawing>
-          <wp:inline distT="0" distB="0" distL="0" distR="0" wp14:anchorId="71379EE6" wp14:editId="7A817CB8">
+          <wp:inline distT="0" distB="0" distL="0" distR="0" wp14:anchorId="6EC51235" wp14:editId="0595E38D">
             <wp:extent cx="5760720" cy="3608070"/>
             <wp:effectExtent l="0" t="0" r="0" b="0"/>
-            <wp:docPr id="1878118542" name="Grafik 1"/>
+            <wp:docPr id="518715589" name="Grafik 1" descr="Ein Bild, das Text, Screenshot, Display, Software enthält.&#10;&#10;KI-generierte Inhalte können fehlerhaft sein."/>
             <wp:cNvGraphicFramePr>
               <a:graphicFrameLocks xmlns:a="http://schemas.openxmlformats.org/drawingml/2006/main" noChangeAspect="1"/>
             </wp:cNvGraphicFramePr>
@@ -265,7 +262,7 @@
               <a:graphicData uri="http://schemas.openxmlformats.org/drawingml/2006/picture">
                 <pic:pic xmlns:pic="http://schemas.openxmlformats.org/drawingml/2006/picture">
                   <pic:nvPicPr>
-                    <pic:cNvPr id="1878118542" name=""/>
+                    <pic:cNvPr id="518715589" name="Grafik 1" descr="Ein Bild, das Text, Screenshot, Display, Software enthält.&#10;&#10;KI-generierte Inhalte können fehlerhaft sein."/>
                     <pic:cNvPicPr/>
                   </pic:nvPicPr>
                   <pic:blipFill>
@@ -413,15 +410,12 @@
     </w:p>
     <w:p>
       <w:r>
-        <w:rPr>
-          <w:noProof/>
-        </w:rPr>
         <w:lastRenderedPageBreak/>
         <w:drawing>
-          <wp:inline distT="0" distB="0" distL="0" distR="0" wp14:anchorId="747DAA3B" wp14:editId="28A5618F">
-            <wp:extent cx="5760720" cy="3608070"/>
-            <wp:effectExtent l="0" t="0" r="0" b="0"/>
-            <wp:docPr id="233072871" name="Grafik 1"/>
+          <wp:inline distT="0" distB="0" distL="0" distR="0" wp14:anchorId="2633B79E" wp14:editId="27E5B0AD">
+            <wp:extent cx="5760720" cy="2755900"/>
+            <wp:effectExtent l="0" t="0" r="0" b="6350"/>
+            <wp:docPr id="322802610" name="Grafik 1" descr="Ein Bild, das Text, Screenshot, Software, Schrift enthält.&#10;&#10;KI-generierte Inhalte können fehlerhaft sein."/>
             <wp:cNvGraphicFramePr>
               <a:graphicFrameLocks xmlns:a="http://schemas.openxmlformats.org/drawingml/2006/main" noChangeAspect="1"/>
             </wp:cNvGraphicFramePr>
@@ -429,7 +423,7 @@
               <a:graphicData uri="http://schemas.openxmlformats.org/drawingml/2006/picture">
                 <pic:pic xmlns:pic="http://schemas.openxmlformats.org/drawingml/2006/picture">
                   <pic:nvPicPr>
-                    <pic:cNvPr id="233072871" name=""/>
+                    <pic:cNvPr id="322802610" name="Grafik 1" descr="Ein Bild, das Text, Screenshot, Software, Schrift enthält.&#10;&#10;KI-generierte Inhalte können fehlerhaft sein."/>
                     <pic:cNvPicPr/>
                   </pic:nvPicPr>
                   <pic:blipFill>
@@ -441,7 +435,7 @@
                   <pic:spPr>
                     <a:xfrm>
                       <a:off x="0" y="0"/>
-                      <a:ext cx="5760720" cy="3608070"/>
+                      <a:ext cx="5760720" cy="2755900"/>
                     </a:xfrm>
                     <a:prstGeom prst="rect">
                       <a:avLst/>
@@ -562,14 +556,11 @@
         <w:ind w:left="360"/>
       </w:pPr>
       <w:r>
-        <w:rPr>
-          <w:noProof/>
-        </w:rPr>
         <w:drawing>
-          <wp:inline distT="0" distB="0" distL="0" distR="0" wp14:anchorId="2A8FB535" wp14:editId="739145D7">
-            <wp:extent cx="5760720" cy="3608070"/>
+          <wp:inline distT="0" distB="0" distL="0" distR="0" wp14:anchorId="42D5C6E4" wp14:editId="645A306E">
+            <wp:extent cx="5760720" cy="3544570"/>
             <wp:effectExtent l="0" t="0" r="0" b="0"/>
-            <wp:docPr id="833864627" name="Grafik 1"/>
+            <wp:docPr id="1300433963" name="Grafik 1" descr="Ein Bild, das Text, Screenshot, Display, Software enthält.&#10;&#10;KI-generierte Inhalte können fehlerhaft sein."/>
             <wp:cNvGraphicFramePr>
               <a:graphicFrameLocks xmlns:a="http://schemas.openxmlformats.org/drawingml/2006/main" noChangeAspect="1"/>
             </wp:cNvGraphicFramePr>
@@ -577,7 +568,7 @@
               <a:graphicData uri="http://schemas.openxmlformats.org/drawingml/2006/picture">
                 <pic:pic xmlns:pic="http://schemas.openxmlformats.org/drawingml/2006/picture">
                   <pic:nvPicPr>
-                    <pic:cNvPr id="833864627" name=""/>
+                    <pic:cNvPr id="1300433963" name="Grafik 1" descr="Ein Bild, das Text, Screenshot, Display, Software enthält.&#10;&#10;KI-generierte Inhalte können fehlerhaft sein."/>
                     <pic:cNvPicPr/>
                   </pic:nvPicPr>
                   <pic:blipFill>
@@ -589,7 +580,7 @@
                   <pic:spPr>
                     <a:xfrm>
                       <a:off x="0" y="0"/>
-                      <a:ext cx="5760720" cy="3608070"/>
+                      <a:ext cx="5760720" cy="3544570"/>
                     </a:xfrm>
                     <a:prstGeom prst="rect">
                       <a:avLst/>
@@ -631,7 +622,6 @@
         </w:numPr>
       </w:pPr>
       <w:r>
-        <w:lastRenderedPageBreak/>
         <w:t xml:space="preserve">Now the </w:t>
       </w:r>
       <w:r>
@@ -726,14 +716,12 @@
     </w:p>
     <w:p>
       <w:r>
-        <w:rPr>
-          <w:noProof/>
-        </w:rPr>
+        <w:lastRenderedPageBreak/>
         <w:drawing>
-          <wp:inline distT="0" distB="0" distL="0" distR="0" wp14:anchorId="778DE336" wp14:editId="5053E5B9">
-            <wp:extent cx="5760720" cy="3608070"/>
+          <wp:inline distT="0" distB="0" distL="0" distR="0" wp14:anchorId="11C966B6" wp14:editId="27D5F4C6">
+            <wp:extent cx="5760720" cy="3544570"/>
             <wp:effectExtent l="0" t="0" r="0" b="0"/>
-            <wp:docPr id="632359064" name="Grafik 1"/>
+            <wp:docPr id="683716603" name="Grafik 1" descr="Ein Bild, das Text, Screenshot, Display, Software enthält.&#10;&#10;KI-generierte Inhalte können fehlerhaft sein."/>
             <wp:cNvGraphicFramePr>
               <a:graphicFrameLocks xmlns:a="http://schemas.openxmlformats.org/drawingml/2006/main" noChangeAspect="1"/>
             </wp:cNvGraphicFramePr>
@@ -741,7 +729,7 @@
               <a:graphicData uri="http://schemas.openxmlformats.org/drawingml/2006/picture">
                 <pic:pic xmlns:pic="http://schemas.openxmlformats.org/drawingml/2006/picture">
                   <pic:nvPicPr>
-                    <pic:cNvPr id="632359064" name=""/>
+                    <pic:cNvPr id="683716603" name="Grafik 1" descr="Ein Bild, das Text, Screenshot, Display, Software enthält.&#10;&#10;KI-generierte Inhalte können fehlerhaft sein."/>
                     <pic:cNvPicPr/>
                   </pic:nvPicPr>
                   <pic:blipFill>
@@ -753,7 +741,7 @@
                   <pic:spPr>
                     <a:xfrm>
                       <a:off x="0" y="0"/>
-                      <a:ext cx="5760720" cy="3608070"/>
+                      <a:ext cx="5760720" cy="3544570"/>
                     </a:xfrm>
                     <a:prstGeom prst="rect">
                       <a:avLst/>
@@ -874,15 +862,11 @@
     </w:p>
     <w:p>
       <w:r>
-        <w:rPr>
-          <w:noProof/>
-        </w:rPr>
-        <w:lastRenderedPageBreak/>
         <w:drawing>
-          <wp:inline distT="0" distB="0" distL="0" distR="0" wp14:anchorId="18B83390" wp14:editId="2C57531E">
-            <wp:extent cx="5760720" cy="3608070"/>
+          <wp:inline distT="0" distB="0" distL="0" distR="0" wp14:anchorId="6DD58407" wp14:editId="527FC720">
+            <wp:extent cx="5760720" cy="3544570"/>
             <wp:effectExtent l="0" t="0" r="0" b="0"/>
-            <wp:docPr id="2051746761" name="Grafik 1"/>
+            <wp:docPr id="279157042" name="Grafik 1" descr="Ein Bild, das Text, Screenshot, Display, Software enthält.&#10;&#10;KI-generierte Inhalte können fehlerhaft sein."/>
             <wp:cNvGraphicFramePr>
               <a:graphicFrameLocks xmlns:a="http://schemas.openxmlformats.org/drawingml/2006/main" noChangeAspect="1"/>
             </wp:cNvGraphicFramePr>
@@ -890,7 +874,7 @@
               <a:graphicData uri="http://schemas.openxmlformats.org/drawingml/2006/picture">
                 <pic:pic xmlns:pic="http://schemas.openxmlformats.org/drawingml/2006/picture">
                   <pic:nvPicPr>
-                    <pic:cNvPr id="2051746761" name=""/>
+                    <pic:cNvPr id="279157042" name="Grafik 1" descr="Ein Bild, das Text, Screenshot, Display, Software enthält.&#10;&#10;KI-generierte Inhalte können fehlerhaft sein."/>
                     <pic:cNvPicPr/>
                   </pic:nvPicPr>
                   <pic:blipFill>
@@ -902,7 +886,7 @@
                   <pic:spPr>
                     <a:xfrm>
                       <a:off x="0" y="0"/>
-                      <a:ext cx="5760720" cy="3608070"/>
+                      <a:ext cx="5760720" cy="3544570"/>
                     </a:xfrm>
                     <a:prstGeom prst="rect">
                       <a:avLst/>
@@ -1002,14 +986,12 @@
     </w:p>
     <w:p>
       <w:r>
-        <w:rPr>
-          <w:noProof/>
-        </w:rPr>
+        <w:lastRenderedPageBreak/>
         <w:drawing>
-          <wp:inline distT="0" distB="0" distL="0" distR="0" wp14:anchorId="0E4A9655" wp14:editId="17006FA9">
-            <wp:extent cx="5760720" cy="3608070"/>
+          <wp:inline distT="0" distB="0" distL="0" distR="0" wp14:anchorId="158403C9" wp14:editId="560851EC">
+            <wp:extent cx="5760720" cy="3544570"/>
             <wp:effectExtent l="0" t="0" r="0" b="0"/>
-            <wp:docPr id="706623185" name="Grafik 1"/>
+            <wp:docPr id="958773934" name="Grafik 1" descr="Ein Bild, das Text, Screenshot, Display, Zahl enthält.&#10;&#10;KI-generierte Inhalte können fehlerhaft sein."/>
             <wp:cNvGraphicFramePr>
               <a:graphicFrameLocks xmlns:a="http://schemas.openxmlformats.org/drawingml/2006/main" noChangeAspect="1"/>
             </wp:cNvGraphicFramePr>
@@ -1017,7 +999,7 @@
               <a:graphicData uri="http://schemas.openxmlformats.org/drawingml/2006/picture">
                 <pic:pic xmlns:pic="http://schemas.openxmlformats.org/drawingml/2006/picture">
                   <pic:nvPicPr>
-                    <pic:cNvPr id="706623185" name=""/>
+                    <pic:cNvPr id="958773934" name="Grafik 1" descr="Ein Bild, das Text, Screenshot, Display, Zahl enthält.&#10;&#10;KI-generierte Inhalte können fehlerhaft sein."/>
                     <pic:cNvPicPr/>
                   </pic:nvPicPr>
                   <pic:blipFill>
@@ -1029,7 +1011,7 @@
                   <pic:spPr>
                     <a:xfrm>
                       <a:off x="0" y="0"/>
-                      <a:ext cx="5760720" cy="3608070"/>
+                      <a:ext cx="5760720" cy="3544570"/>
                     </a:xfrm>
                     <a:prstGeom prst="rect">
                       <a:avLst/>
@@ -1124,7 +1106,6 @@
         <w:t xml:space="preserve">. </w:t>
       </w:r>
       <w:r>
-        <w:lastRenderedPageBreak/>
         <w:t>The result</w:t>
       </w:r>
       <w:r>
@@ -1145,14 +1126,11 @@
     </w:p>
     <w:p>
       <w:r>
-        <w:rPr>
-          <w:noProof/>
-        </w:rPr>
         <w:drawing>
-          <wp:inline distT="0" distB="0" distL="0" distR="0" wp14:anchorId="69FA4F72" wp14:editId="0E7ADDCC">
-            <wp:extent cx="5760720" cy="3608070"/>
+          <wp:inline distT="0" distB="0" distL="0" distR="0" wp14:anchorId="73F5507C" wp14:editId="5F324BB9">
+            <wp:extent cx="5760720" cy="3544570"/>
             <wp:effectExtent l="0" t="0" r="0" b="0"/>
-            <wp:docPr id="131903289" name="Grafik 1"/>
+            <wp:docPr id="2043140815" name="Grafik 1" descr="Ein Bild, das Text, Screenshot, Display, Software enthält.&#10;&#10;KI-generierte Inhalte können fehlerhaft sein."/>
             <wp:cNvGraphicFramePr>
               <a:graphicFrameLocks xmlns:a="http://schemas.openxmlformats.org/drawingml/2006/main" noChangeAspect="1"/>
             </wp:cNvGraphicFramePr>
@@ -1160,7 +1138,7 @@
               <a:graphicData uri="http://schemas.openxmlformats.org/drawingml/2006/picture">
                 <pic:pic xmlns:pic="http://schemas.openxmlformats.org/drawingml/2006/picture">
                   <pic:nvPicPr>
-                    <pic:cNvPr id="131903289" name=""/>
+                    <pic:cNvPr id="2043140815" name="Grafik 1" descr="Ein Bild, das Text, Screenshot, Display, Software enthält.&#10;&#10;KI-generierte Inhalte können fehlerhaft sein."/>
                     <pic:cNvPicPr/>
                   </pic:nvPicPr>
                   <pic:blipFill>
@@ -1172,7 +1150,7 @@
                   <pic:spPr>
                     <a:xfrm>
                       <a:off x="0" y="0"/>
-                      <a:ext cx="5760720" cy="3608070"/>
+                      <a:ext cx="5760720" cy="3544570"/>
                     </a:xfrm>
                     <a:prstGeom prst="rect">
                       <a:avLst/>
@@ -1226,14 +1204,12 @@
         <w:ind w:left="360"/>
       </w:pPr>
       <w:r>
-        <w:rPr>
-          <w:noProof/>
-        </w:rPr>
+        <w:lastRenderedPageBreak/>
         <w:drawing>
-          <wp:inline distT="0" distB="0" distL="0" distR="0" wp14:anchorId="79E1E9B0" wp14:editId="1574B5E1">
-            <wp:extent cx="5760720" cy="3608070"/>
+          <wp:inline distT="0" distB="0" distL="0" distR="0" wp14:anchorId="6604F3E5" wp14:editId="10B225CA">
+            <wp:extent cx="5760720" cy="3544570"/>
             <wp:effectExtent l="0" t="0" r="0" b="0"/>
-            <wp:docPr id="2061642826" name="Grafik 1"/>
+            <wp:docPr id="589438090" name="Grafik 1" descr="Ein Bild, das Text, Screenshot, Display, Zahl enthält.&#10;&#10;KI-generierte Inhalte können fehlerhaft sein."/>
             <wp:cNvGraphicFramePr>
               <a:graphicFrameLocks xmlns:a="http://schemas.openxmlformats.org/drawingml/2006/main" noChangeAspect="1"/>
             </wp:cNvGraphicFramePr>
@@ -1241,7 +1217,7 @@
               <a:graphicData uri="http://schemas.openxmlformats.org/drawingml/2006/picture">
                 <pic:pic xmlns:pic="http://schemas.openxmlformats.org/drawingml/2006/picture">
                   <pic:nvPicPr>
-                    <pic:cNvPr id="2061642826" name=""/>
+                    <pic:cNvPr id="589438090" name="Grafik 1" descr="Ein Bild, das Text, Screenshot, Display, Zahl enthält.&#10;&#10;KI-generierte Inhalte können fehlerhaft sein."/>
                     <pic:cNvPicPr/>
                   </pic:nvPicPr>
                   <pic:blipFill>
@@ -1253,7 +1229,7 @@
                   <pic:spPr>
                     <a:xfrm>
                       <a:off x="0" y="0"/>
-                      <a:ext cx="5760720" cy="3608070"/>
+                      <a:ext cx="5760720" cy="3544570"/>
                     </a:xfrm>
                     <a:prstGeom prst="rect">
                       <a:avLst/>
@@ -1297,11 +1273,7 @@
         <w:t xml:space="preserve"> constant</w:t>
       </w:r>
       <w:r>
-        <w:t xml:space="preserve">s are calculated using the density of states of all loaded wells and the sum of states of all loaded </w:t>
-      </w:r>
-      <w:r>
-        <w:lastRenderedPageBreak/>
-        <w:t>transition states. Other possible channel definitions are inactive, as the other lines start with a semicolon “;” and all text after semicolons is treated as a comment by the program. For our example calculation, we just use the default settings and do not change the panel “Parameters”. Click on the button “</w:t>
+        <w:t>s are calculated using the density of states of all loaded wells and the sum of states of all loaded transition states. Other possible channel definitions are inactive, as the other lines start with a semicolon “;” and all text after semicolons is treated as a comment by the program. For our example calculation, we just use the default settings and do not change the panel “Parameters”. Click on the button “</w:t>
       </w:r>
       <w:r>
         <w:rPr>
@@ -1346,14 +1318,11 @@
         <w:ind w:left="360"/>
       </w:pPr>
       <w:r>
-        <w:rPr>
-          <w:noProof/>
-        </w:rPr>
         <w:drawing>
-          <wp:inline distT="0" distB="0" distL="0" distR="0" wp14:anchorId="2D598777" wp14:editId="240854CD">
-            <wp:extent cx="5760720" cy="3608070"/>
+          <wp:inline distT="0" distB="0" distL="0" distR="0" wp14:anchorId="0B834F7F" wp14:editId="2F8228B4">
+            <wp:extent cx="5760720" cy="3544570"/>
             <wp:effectExtent l="0" t="0" r="0" b="0"/>
-            <wp:docPr id="1638995855" name="Grafik 1"/>
+            <wp:docPr id="674551415" name="Grafik 1" descr="Ein Bild, das Text, Screenshot, Display, Software enthält.&#10;&#10;KI-generierte Inhalte können fehlerhaft sein."/>
             <wp:cNvGraphicFramePr>
               <a:graphicFrameLocks xmlns:a="http://schemas.openxmlformats.org/drawingml/2006/main" noChangeAspect="1"/>
             </wp:cNvGraphicFramePr>
@@ -1361,7 +1330,7 @@
               <a:graphicData uri="http://schemas.openxmlformats.org/drawingml/2006/picture">
                 <pic:pic xmlns:pic="http://schemas.openxmlformats.org/drawingml/2006/picture">
                   <pic:nvPicPr>
-                    <pic:cNvPr id="1638995855" name=""/>
+                    <pic:cNvPr id="674551415" name="Grafik 1" descr="Ein Bild, das Text, Screenshot, Display, Software enthält.&#10;&#10;KI-generierte Inhalte können fehlerhaft sein."/>
                     <pic:cNvPicPr/>
                   </pic:nvPicPr>
                   <pic:blipFill>
@@ -1373,7 +1342,7 @@
                   <pic:spPr>
                     <a:xfrm>
                       <a:off x="0" y="0"/>
-                      <a:ext cx="5760720" cy="3608070"/>
+                      <a:ext cx="5760720" cy="3544570"/>
                     </a:xfrm>
                     <a:prstGeom prst="rect">
                       <a:avLst/>
@@ -1443,6 +1412,7 @@
         <w:ind w:left="360"/>
       </w:pPr>
       <w:r>
+        <w:lastRenderedPageBreak/>
         <w:t xml:space="preserve">Finally, we want to </w:t>
       </w:r>
       <w:r>
@@ -1513,15 +1483,11 @@
     </w:p>
     <w:p>
       <w:r>
-        <w:rPr>
-          <w:noProof/>
-        </w:rPr>
-        <w:lastRenderedPageBreak/>
         <w:drawing>
-          <wp:inline distT="0" distB="0" distL="0" distR="0" wp14:anchorId="45B94FC8" wp14:editId="4FEBC5C0">
-            <wp:extent cx="5760720" cy="3608070"/>
+          <wp:inline distT="0" distB="0" distL="0" distR="0" wp14:anchorId="3C11E0C8" wp14:editId="0A2F3369">
+            <wp:extent cx="5760720" cy="3544570"/>
             <wp:effectExtent l="0" t="0" r="0" b="0"/>
-            <wp:docPr id="1477176089" name="Grafik 1"/>
+            <wp:docPr id="1550557481" name="Grafik 1" descr="Ein Bild, das Text, Elektronik, Screenshot, Software enthält.&#10;&#10;KI-generierte Inhalte können fehlerhaft sein."/>
             <wp:cNvGraphicFramePr>
               <a:graphicFrameLocks xmlns:a="http://schemas.openxmlformats.org/drawingml/2006/main" noChangeAspect="1"/>
             </wp:cNvGraphicFramePr>
@@ -1529,7 +1495,7 @@
               <a:graphicData uri="http://schemas.openxmlformats.org/drawingml/2006/picture">
                 <pic:pic xmlns:pic="http://schemas.openxmlformats.org/drawingml/2006/picture">
                   <pic:nvPicPr>
-                    <pic:cNvPr id="1477176089" name=""/>
+                    <pic:cNvPr id="1550557481" name="Grafik 1" descr="Ein Bild, das Text, Elektronik, Screenshot, Software enthält.&#10;&#10;KI-generierte Inhalte können fehlerhaft sein."/>
                     <pic:cNvPicPr/>
                   </pic:nvPicPr>
                   <pic:blipFill>
@@ -1541,7 +1507,7 @@
                   <pic:spPr>
                     <a:xfrm>
                       <a:off x="0" y="0"/>
-                      <a:ext cx="5760720" cy="3608070"/>
+                      <a:ext cx="5760720" cy="3544570"/>
                     </a:xfrm>
                     <a:prstGeom prst="rect">
                       <a:avLst/>
@@ -1593,6 +1559,7 @@
     </w:p>
     <w:p>
       <w:r>
+        <w:lastRenderedPageBreak/>
         <w:t>An additional console window opens, showing the progress of the calculation:</w:t>
       </w:r>
       <w:r>
@@ -1606,10 +1573,10 @@
           <w:noProof/>
         </w:rPr>
         <w:drawing>
-          <wp:inline distT="0" distB="0" distL="0" distR="0" wp14:anchorId="062621EF" wp14:editId="1E61FDAA">
+          <wp:inline distT="0" distB="0" distL="0" distR="0" wp14:anchorId="553E3970" wp14:editId="6B0FA3DD">
             <wp:extent cx="5760720" cy="3335020"/>
             <wp:effectExtent l="0" t="0" r="0" b="0"/>
-            <wp:docPr id="1483653746" name="Grafik 1"/>
+            <wp:docPr id="1263253164" name="Grafik 1" descr="Ein Bild, das Text, Screenshot, Computer, Display enthält.&#10;&#10;KI-generierte Inhalte können fehlerhaft sein."/>
             <wp:cNvGraphicFramePr>
               <a:graphicFrameLocks xmlns:a="http://schemas.openxmlformats.org/drawingml/2006/main" noChangeAspect="1"/>
             </wp:cNvGraphicFramePr>
@@ -1617,7 +1584,7 @@
               <a:graphicData uri="http://schemas.openxmlformats.org/drawingml/2006/picture">
                 <pic:pic xmlns:pic="http://schemas.openxmlformats.org/drawingml/2006/picture">
                   <pic:nvPicPr>
-                    <pic:cNvPr id="1483653746" name=""/>
+                    <pic:cNvPr id="1263253164" name="Grafik 1" descr="Ein Bild, das Text, Screenshot, Computer, Display enthält.&#10;&#10;KI-generierte Inhalte können fehlerhaft sein."/>
                     <pic:cNvPicPr/>
                   </pic:nvPicPr>
                   <pic:blipFill>
@@ -1649,15 +1616,11 @@
     </w:p>
     <w:p>
       <w:r>
-        <w:rPr>
-          <w:noProof/>
-        </w:rPr>
-        <w:lastRenderedPageBreak/>
         <w:drawing>
-          <wp:inline distT="0" distB="0" distL="0" distR="0" wp14:anchorId="13E4A695" wp14:editId="7295E0D6">
-            <wp:extent cx="5760720" cy="3608070"/>
+          <wp:inline distT="0" distB="0" distL="0" distR="0" wp14:anchorId="372C2AF8" wp14:editId="3D5BA09A">
+            <wp:extent cx="5760720" cy="3544570"/>
             <wp:effectExtent l="0" t="0" r="0" b="0"/>
-            <wp:docPr id="89279220" name="Grafik 1"/>
+            <wp:docPr id="600616175" name="Grafik 1" descr="Ein Bild, das Text, Screenshot, Display, Software enthält.&#10;&#10;KI-generierte Inhalte können fehlerhaft sein."/>
             <wp:cNvGraphicFramePr>
               <a:graphicFrameLocks xmlns:a="http://schemas.openxmlformats.org/drawingml/2006/main" noChangeAspect="1"/>
             </wp:cNvGraphicFramePr>
@@ -1665,7 +1628,7 @@
               <a:graphicData uri="http://schemas.openxmlformats.org/drawingml/2006/picture">
                 <pic:pic xmlns:pic="http://schemas.openxmlformats.org/drawingml/2006/picture">
                   <pic:nvPicPr>
-                    <pic:cNvPr id="89279220" name=""/>
+                    <pic:cNvPr id="600616175" name="Grafik 1" descr="Ein Bild, das Text, Screenshot, Display, Software enthält.&#10;&#10;KI-generierte Inhalte können fehlerhaft sein."/>
                     <pic:cNvPicPr/>
                   </pic:nvPicPr>
                   <pic:blipFill>
@@ -1677,7 +1640,7 @@
                   <pic:spPr>
                     <a:xfrm>
                       <a:off x="0" y="0"/>
-                      <a:ext cx="5760720" cy="3608070"/>
+                      <a:ext cx="5760720" cy="3544570"/>
                     </a:xfrm>
                     <a:prstGeom prst="rect">
                       <a:avLst/>
@@ -1753,6 +1716,7 @@
     </w:p>
     <w:p>
       <w:r>
+        <w:lastRenderedPageBreak/>
         <w:t>During MEM the calculated populations are stored to a separate txt-file in the folder of the AWATAR_1.0.exe file. The name of this file is defined by the filename at the</w:t>
       </w:r>
       <w:r>
@@ -4458,6 +4422,7 @@
     <w:rsid w:val="004E1A5B"/>
     <w:rsid w:val="00523799"/>
     <w:rsid w:val="005F7E16"/>
+    <w:rsid w:val="00696ADA"/>
     <w:rsid w:val="006C51B8"/>
     <w:rsid w:val="007351AC"/>
     <w:rsid w:val="00754789"/>
@@ -4477,6 +4442,7 @@
     <w:rsid w:val="00C43354"/>
     <w:rsid w:val="00C907B6"/>
     <w:rsid w:val="00D42030"/>
+    <w:rsid w:val="00D66C13"/>
     <w:rsid w:val="00D9411D"/>
     <w:rsid w:val="00DF4984"/>
     <w:rsid w:val="00E85A7C"/>

</xml_diff>